<commit_message>
Fix workshop games, search and agendas; enable mandate challenge
Apply reviewed display shuffling and clearer connection errors, add the server-backed mandate game, adapt dialogue scenarios to Bangladesh, and correct agenda labels and placeholders. Validate all 40 challenge rounds, protected downloads, search and server scoring.
</commit_message>
<xml_diff>
--- a/dist/downloads/A3519987/A3519987_Agenda_Strengthening_Tripartite_SD_Institutions_Rev.3.docx
+++ b/dist/downloads/A3519987/A3519987_Agenda_Strengthening_Tripartite_SD_Institutions_Rev.3.docx
@@ -14,7 +14,7 @@
           <w:sz w:val="16"/>
           <w:szCs w:val="16"/>
         </w:rPr>
-        <w:t xml:space="preserve">DRAFT </w:t>
+        <w:t>DRAFT PROGRAMME  ·  REVISION 3  ·  23 October 2026</w:t>
       </w:r>
       <w:proofErr w:type="gramStart"/>
       <w:r>
@@ -25,7 +25,6 @@
           <w:sz w:val="16"/>
           <w:szCs w:val="16"/>
         </w:rPr>
-        <w:t>PROGRAMME  ·</w:t>
       </w:r>
       <w:proofErr w:type="gramEnd"/>
       <w:r>
@@ -36,7 +35,6 @@
           <w:sz w:val="16"/>
           <w:szCs w:val="16"/>
         </w:rPr>
-        <w:t xml:space="preserve">  REVISION </w:t>
       </w:r>
       <w:proofErr w:type="gramStart"/>
       <w:r>
@@ -47,7 +45,6 @@
           <w:sz w:val="16"/>
           <w:szCs w:val="16"/>
         </w:rPr>
-        <w:t>2  ·</w:t>
       </w:r>
       <w:proofErr w:type="gramEnd"/>
       <w:r>
@@ -58,7 +55,6 @@
           <w:sz w:val="16"/>
           <w:szCs w:val="16"/>
         </w:rPr>
-        <w:t xml:space="preserve">  22 October 2026</w:t>
       </w:r>
     </w:p>
     <w:p>
@@ -248,6 +244,54 @@
                 <w:bCs/>
                 <w:color w:val="1F4E79"/>
               </w:rPr>
+              <w:t>Preparation phase</w:t>
+            </w:r>
+          </w:p>
+        </w:tc>
+        <w:tc>
+          <w:tcPr>
+            <w:tcW w:w="7596" w:type="dxa"/>
+            <w:tcMar>
+              <w:top w:w="90" w:type="dxa"/>
+              <w:left w:w="120" w:type="dxa"/>
+              <w:bottom w:w="90" w:type="dxa"/>
+              <w:right w:w="120" w:type="dxa"/>
+            </w:tcMar>
+          </w:tcPr>
+          <w:p>
+            <w:r>
+              <w:t>Pre-course learning and reflection; dates and arrangements to be confirmed. Session 1 includes a review of this preparation.</w:t>
+            </w:r>
+          </w:p>
+        </w:tc>
+      </w:tr>
+      <w:tr>
+        <w:tblPrEx>
+          <w:tblCellMar>
+            <w:top w:w="0" w:type="dxa"/>
+            <w:bottom w:w="0" w:type="dxa"/>
+          </w:tblCellMar>
+        </w:tblPrEx>
+        <w:trPr>
+          <w:cantSplit/>
+        </w:trPr>
+        <w:tc>
+          <w:tcPr>
+            <w:tcW w:w="2150" w:type="dxa"/>
+            <w:tcMar>
+              <w:top w:w="90" w:type="dxa"/>
+              <w:left w:w="120" w:type="dxa"/>
+              <w:bottom w:w="90" w:type="dxa"/>
+              <w:right w:w="120" w:type="dxa"/>
+            </w:tcMar>
+          </w:tcPr>
+          <w:p>
+            <w:r>
+              <w:rPr>
+                <w:b/>
+                <w:bCs/>
+                <w:color w:val="1F4E79"/>
+              </w:rPr>
               <w:t>Venue</w:t>
             </w:r>
           </w:p>
@@ -837,7 +881,11 @@
               <w:right w:w="120" w:type="dxa"/>
             </w:tcMar>
           </w:tcPr>
-          <w:p/>
+          <w:p>
+            <w:r>
+              <w:t>To be confirmed</w:t>
+            </w:r>
+          </w:p>
         </w:tc>
       </w:tr>
       <w:tr>
@@ -1029,7 +1077,11 @@
               <w:right w:w="120" w:type="dxa"/>
             </w:tcMar>
           </w:tcPr>
-          <w:p/>
+          <w:p>
+            <w:r>
+              <w:t>To be confirmed</w:t>
+            </w:r>
+          </w:p>
         </w:tc>
       </w:tr>
       <w:tr>
@@ -1235,7 +1287,11 @@
               <w:right w:w="120" w:type="dxa"/>
             </w:tcMar>
           </w:tcPr>
-          <w:p/>
+          <w:p>
+            <w:r>
+              <w:t>To be confirmed</w:t>
+            </w:r>
+          </w:p>
         </w:tc>
       </w:tr>
       <w:tr>
@@ -1440,7 +1496,11 @@
               <w:right w:w="120" w:type="dxa"/>
             </w:tcMar>
           </w:tcPr>
-          <w:p/>
+          <w:p>
+            <w:r>
+              <w:t>To be confirmed</w:t>
+            </w:r>
+          </w:p>
         </w:tc>
       </w:tr>
       <w:tr>
@@ -1580,7 +1640,11 @@
               <w:right w:w="120" w:type="dxa"/>
             </w:tcMar>
           </w:tcPr>
-          <w:p/>
+          <w:p>
+            <w:r>
+              <w:t>To be confirmed</w:t>
+            </w:r>
+          </w:p>
         </w:tc>
       </w:tr>
       <w:tr>
@@ -1814,7 +1878,11 @@
               <w:right w:w="120" w:type="dxa"/>
             </w:tcMar>
           </w:tcPr>
-          <w:p/>
+          <w:p>
+            <w:r>
+              <w:t>To be confirmed</w:t>
+            </w:r>
+          </w:p>
         </w:tc>
       </w:tr>
       <w:tr>
@@ -2019,7 +2087,11 @@
               <w:right w:w="120" w:type="dxa"/>
             </w:tcMar>
           </w:tcPr>
-          <w:p/>
+          <w:p>
+            <w:r>
+              <w:t>To be confirmed</w:t>
+            </w:r>
+          </w:p>
         </w:tc>
       </w:tr>
       <w:tr>
@@ -2173,7 +2245,11 @@
               <w:right w:w="120" w:type="dxa"/>
             </w:tcMar>
           </w:tcPr>
-          <w:p/>
+          <w:p>
+            <w:r>
+              <w:t>To be confirmed</w:t>
+            </w:r>
+          </w:p>
         </w:tc>
       </w:tr>
       <w:tr>
@@ -2352,7 +2428,11 @@
               <w:right w:w="120" w:type="dxa"/>
             </w:tcMar>
           </w:tcPr>
-          <w:p/>
+          <w:p>
+            <w:r>
+              <w:t>To be confirmed</w:t>
+            </w:r>
+          </w:p>
         </w:tc>
       </w:tr>
       <w:tr>
@@ -2531,7 +2611,11 @@
               <w:right w:w="120" w:type="dxa"/>
             </w:tcMar>
           </w:tcPr>
-          <w:p/>
+          <w:p>
+            <w:r>
+              <w:t>To be confirmed</w:t>
+            </w:r>
+          </w:p>
         </w:tc>
       </w:tr>
       <w:tr>
@@ -2713,7 +2797,11 @@
               <w:right w:w="120" w:type="dxa"/>
             </w:tcMar>
           </w:tcPr>
-          <w:p/>
+          <w:p>
+            <w:r>
+              <w:t>To be confirmed</w:t>
+            </w:r>
+          </w:p>
         </w:tc>
       </w:tr>
       <w:tr>
@@ -2853,7 +2941,11 @@
               <w:right w:w="120" w:type="dxa"/>
             </w:tcMar>
           </w:tcPr>
-          <w:p/>
+          <w:p>
+            <w:r>
+              <w:t>To be confirmed</w:t>
+            </w:r>
+          </w:p>
         </w:tc>
       </w:tr>
       <w:tr>
@@ -3032,7 +3124,11 @@
               <w:right w:w="120" w:type="dxa"/>
             </w:tcMar>
           </w:tcPr>
-          <w:p/>
+          <w:p>
+            <w:r>
+              <w:t>To be confirmed</w:t>
+            </w:r>
+          </w:p>
         </w:tc>
       </w:tr>
       <w:tr>
@@ -3098,7 +3194,11 @@
               <w:right w:w="120" w:type="dxa"/>
             </w:tcMar>
           </w:tcPr>
-          <w:p/>
+          <w:p>
+            <w:r>
+              <w:t>To be confirmed</w:t>
+            </w:r>
+          </w:p>
         </w:tc>
       </w:tr>
     </w:tbl>

</xml_diff>